<commit_message>
Review and correct all weekly curriculum editions
</commit_message>
<xml_diff>
--- a/downloads/student/ai-1-week-08.docx
+++ b/downloads/student/ai-1-week-08.docx
@@ -1883,7 +1883,7 @@
         <w:rPr>
           <w:b w:val="0"/>
         </w:rPr>
-        <w:t>Reason: Both dimensions now meet their including equality limits; stripe pattern does not change the rule.</w:t>
+        <w:t>Reason: Both dimensions now meet their limits, with equality allowed; stripe pattern does not change the rule.</w:t>
       </w:r>
     </w:p>
     <w:p>
@@ -7448,7 +7448,7 @@
         <w:rPr>
           <w:b w:val="0"/>
         </w:rPr>
-        <w:t>After your attempt, compare with the supported explanation: Q fits the shelf. Both dimensions now meet their including equality limits; stripe pattern does not change the rule.</w:t>
+        <w:t>After your attempt, compare with the supported explanation: Q fits the shelf. Both dimensions now meet their limits, with equality allowed; stripe pattern does not change the rule.</w:t>
       </w:r>
     </w:p>
     <w:p>
@@ -7888,7 +7888,7 @@
         <w:drawing>
           <wp:inline xmlns:a="http://schemas.openxmlformats.org/drawingml/2006/main" xmlns:pic="http://schemas.openxmlformats.org/drawingml/2006/picture">
             <wp:extent cx="5486400" cy="3179064"/>
-            <wp:docPr id="26" name="Picture 26" descr="Original case: The later sticker cannot be an input available before checking. Changed condition: Change Q’s width to 6 without changing its height. Expected result: Q fits the shelf. Reason: Both dimensions now meet their including equality limits; stripe pattern does not change the rule."/>
+            <wp:docPr id="26" name="Picture 26" descr="Original case: The later sticker cannot be an input available before checking. Changed condition: Change Q’s width to 6 without changing its height. Expected result: Q fits the shelf. Reason: Both dimensions now meet their limits, with equality allowed; stripe pattern does not change the rule."/>
             <wp:cNvGraphicFramePr>
               <a:graphicFrameLocks noChangeAspect="1"/>
             </wp:cNvGraphicFramePr>
@@ -7950,7 +7950,7 @@
         <w:rPr>
           <w:b w:val="0"/>
         </w:rPr>
-        <w:t>Reason: Both dimensions now meet their including equality limits; stripe pattern does not change the rule.</w:t>
+        <w:t>Reason: Both dimensions now meet their limits, with equality allowed; stripe pattern does not change the rule.</w:t>
       </w:r>
     </w:p>
     <w:p>

</xml_diff>